<commit_message>
404 VCA first pass layout/schematic
</commit_message>
<xml_diff>
--- a/Hardware/Hardware Design Practices and Specifications.docx
+++ b/Hardware/Hardware Design Practices and Specifications.docx
@@ -19,6 +19,9 @@
       </w:r>
       <w:r>
         <w:t>Dimensions</w:t>
+      </w:r>
+      <w:r>
+        <w:t xml:space="preserve"> Eurorack 3U</w:t>
       </w:r>
     </w:p>
     <w:p>
@@ -62,6 +65,72 @@
         <w:pStyle w:val="Heading2"/>
       </w:pPr>
       <w:r>
+        <w:t xml:space="preserve">Panel Dimensions </w:t>
+      </w:r>
+      <w:r>
+        <w:t>DIALTONE 4U</w:t>
+      </w:r>
+    </w:p>
+    <w:p>
+      <w:pPr>
+        <w:pStyle w:val="ListParagraph"/>
+        <w:numPr>
+          <w:ilvl w:val="0"/>
+          <w:numId w:val="2"/>
+        </w:numPr>
+      </w:pPr>
+      <w:r>
+        <w:t xml:space="preserve">Panel height shall be </w:t>
+      </w:r>
+      <w:r>
+        <w:t>6.810</w:t>
+      </w:r>
+      <w:r>
+        <w:t>"</w:t>
+      </w:r>
+    </w:p>
+    <w:p>
+      <w:pPr>
+        <w:pStyle w:val="ListParagraph"/>
+        <w:numPr>
+          <w:ilvl w:val="0"/>
+          <w:numId w:val="2"/>
+        </w:numPr>
+      </w:pPr>
+      <w:r>
+        <w:t>Panel width will be an integer multiple of 0.2"</w:t>
+      </w:r>
+    </w:p>
+    <w:p>
+      <w:pPr>
+        <w:pStyle w:val="ListParagraph"/>
+        <w:numPr>
+          <w:ilvl w:val="0"/>
+          <w:numId w:val="2"/>
+        </w:numPr>
+      </w:pPr>
+      <w:r>
+        <w:t>Mounting holes shall be 340 mils from horizontal edge and 120 mils from vertical edge</w:t>
+      </w:r>
+    </w:p>
+    <w:p>
+      <w:pPr>
+        <w:pStyle w:val="ListParagraph"/>
+        <w:numPr>
+          <w:ilvl w:val="0"/>
+          <w:numId w:val="2"/>
+        </w:numPr>
+      </w:pPr>
+      <w:r>
+        <w:t>Center of any knob or switch shall be at least 0.600” from the edge of the panel</w:t>
+      </w:r>
+    </w:p>
+    <w:p/>
+    <w:p>
+      <w:pPr>
+        <w:pStyle w:val="Heading2"/>
+      </w:pPr>
+      <w:r>
         <w:t>Panel Text</w:t>
       </w:r>
     </w:p>
@@ -191,6 +260,7 @@
         <w:pStyle w:val="Heading1"/>
       </w:pPr>
       <w:r>
+        <w:lastRenderedPageBreak/>
         <w:t>PCB Specifications</w:t>
       </w:r>
     </w:p>
@@ -203,6 +273,9 @@
       </w:r>
       <w:r>
         <w:t>Dimensions</w:t>
+      </w:r>
+      <w:r>
+        <w:t xml:space="preserve"> 3U</w:t>
       </w:r>
     </w:p>
     <w:p>
@@ -253,8 +326,82 @@
         </w:numPr>
       </w:pPr>
       <w:r>
+        <w:t>The top of the PCB shall be 0.4</w:t>
+      </w:r>
+      <w:r>
+        <w:t>0</w:t>
+      </w:r>
+      <w:r>
+        <w:t>0" from the top of the panel</w:t>
+      </w:r>
+    </w:p>
+    <w:p>
+      <w:pPr>
+        <w:pStyle w:val="Heading2"/>
+      </w:pPr>
+      <w:r>
+        <w:t xml:space="preserve">PCB Dimensions </w:t>
+      </w:r>
+      <w:r>
+        <w:t>4</w:t>
+      </w:r>
+      <w:r>
+        <w:t>U</w:t>
+      </w:r>
+    </w:p>
+    <w:p>
+      <w:pPr>
+        <w:pStyle w:val="ListParagraph"/>
+        <w:numPr>
+          <w:ilvl w:val="0"/>
+          <w:numId w:val="1"/>
+        </w:numPr>
+      </w:pPr>
+      <w:r>
+        <w:t xml:space="preserve">PCB height shall be </w:t>
+      </w:r>
+      <w:r>
+        <w:t>6.</w:t>
+      </w:r>
+      <w:r>
+        <w:t>0</w:t>
+      </w:r>
+      <w:r>
+        <w:t>0</w:t>
+      </w:r>
+      <w:r>
+        <w:t xml:space="preserve">" </w:t>
+      </w:r>
+    </w:p>
+    <w:p>
+      <w:pPr>
+        <w:pStyle w:val="ListParagraph"/>
+        <w:numPr>
+          <w:ilvl w:val="0"/>
+          <w:numId w:val="1"/>
+        </w:numPr>
+      </w:pPr>
+      <w:r>
+        <w:t>PCB width shall be 80mils less than the width of the panel with 40mil space on each side.</w:t>
+      </w:r>
+    </w:p>
+    <w:p>
+      <w:pPr>
+        <w:pStyle w:val="ListParagraph"/>
+        <w:numPr>
+          <w:ilvl w:val="0"/>
+          <w:numId w:val="1"/>
+        </w:numPr>
+      </w:pPr>
+      <w:r>
         <w:t>The top of the PCB shall be 0.430" from the top of the panel</w:t>
       </w:r>
+    </w:p>
+    <w:p/>
+    <w:p>
+      <w:pPr>
+        <w:pStyle w:val="ListParagraph"/>
+      </w:pPr>
     </w:p>
     <w:p>
       <w:pPr>
@@ -566,6 +713,7 @@
               <w:jc w:val="center"/>
             </w:pPr>
             <w:r>
+              <w:lastRenderedPageBreak/>
               <w:t>User.5</w:t>
             </w:r>
           </w:p>
@@ -699,7 +847,6 @@
         <w:pStyle w:val="Heading2"/>
       </w:pPr>
       <w:r>
-        <w:lastRenderedPageBreak/>
         <w:t>Component Fields</w:t>
       </w:r>
     </w:p>
@@ -967,11 +1114,10 @@
       <w:pPr>
         <w:pStyle w:val="Heading2"/>
       </w:pPr>
-      <w:proofErr w:type="spellStart"/>
-      <w:r>
+      <w:r>
+        <w:lastRenderedPageBreak/>
         <w:t>Titleblocks</w:t>
       </w:r>
-      <w:proofErr w:type="spellEnd"/>
     </w:p>
     <w:p>
       <w:r>

</xml_diff>